<commit_message>
Fix invoice template: correct all fields and add dynamic benefits + notes
- Rebuild invoice_template.docx from original: restores date, contact_name,
  company_name, address, email placeholders that were lost in previous rebuild
- Remove hardcoded LPGPCONNECTCOMLTD prefix from invoice number field
- Replace hardcoded bullet list (P74-P82) with docxtemplater paragraph loop:
  {{#benefits}} / {{.}} / {{/benefits}} so each item renders as its own bullet
- Add "Additional Notes: {{additional_notes}}" paragraph after bullet list
- Update /api/generate-invoice to accept benefits (array) and additional_notes
- Add Benefits textarea (one per line) and Additional Notes textarea to modal
- Clear new fields when modal opens

https://claude.ai/code/session_01LWqSqCoTVtRhGcB3aaw8Eo
</commit_message>
<xml_diff>
--- a/public/invoice_template.docx
+++ b/public/invoice_template.docx
@@ -534,13 +534,6 @@
                 <w:rFonts w:ascii="Microsoft Sans Serif" w:hAnsi="Microsoft Sans Serif" w:cs="Microsoft Sans Serif"/>
               </w:rPr>
               <w:t xml:space="preserve"> </w:t>
-            </w:r>
-            <w:r>
-              <w:rPr>
-                <w:rFonts w:ascii="Microsoft Sans Serif" w:hAnsi="Microsoft Sans Serif" w:cs="Microsoft Sans Serif"/>
-                <w:color w:val="000000"/>
-              </w:rPr>
-              <w:t>LPGPCONNECTCOMLTD</w:t>
             </w:r>
             <w:r>
               <w:rPr>
@@ -1767,6 +1760,22 @@
     </w:p>
     <w:p>
       <w:pPr>
+        <w:spacing w:line="240" w:lineRule="auto"/>
+        <w:rPr>
+          <w:rFonts w:ascii="Aptos" w:hAnsi="Aptos" w:eastAsia="Aptos" w:cs="Aptos"/>
+          <w:color w:val="auto"/>
+          <w:sz w:val="22"/>
+          <w:szCs w:val="22"/>
+          <w:lang w:val="en-GB" w:eastAsia="en-US"/>
+          <w14:ligatures w14:val="standardContextual"/>
+        </w:rPr>
+      </w:pPr>
+      <w:r>
+        <w:t>{{#benefits}}</w:t>
+      </w:r>
+    </w:p>
+    <w:p>
+      <w:pPr>
         <w:numPr>
           <w:ilvl w:val="0"/>
           <w:numId w:val="38"/>
@@ -1790,16 +1799,38 @@
           <w:lang w:val="en-GB" w:eastAsia="en-US"/>
           <w14:ligatures w14:val="standardContextual"/>
         </w:rPr>
-        <w:t>Speaker on a Panel (subject to availability)</w:t>
+        <w:t>{{.}}</w:t>
       </w:r>
     </w:p>
     <w:p>
       <w:pPr>
-        <w:numPr>
-          <w:ilvl w:val="0"/>
-          <w:numId w:val="38"/>
-        </w:numPr>
         <w:spacing w:line="240" w:lineRule="auto"/>
+        <w:rPr>
+          <w:rFonts w:ascii="Aptos" w:hAnsi="Aptos" w:eastAsia="Aptos" w:cs="Aptos"/>
+          <w:color w:val="auto"/>
+          <w:sz w:val="22"/>
+          <w:szCs w:val="22"/>
+          <w:lang w:val="en-GB" w:eastAsia="en-US"/>
+          <w14:ligatures w14:val="standardContextual"/>
+        </w:rPr>
+      </w:pPr>
+      <w:r>
+        <w:t>{{/benefits}}</w:t>
+      </w:r>
+    </w:p>
+    <w:p>
+      <w:pPr>
+        <w:spacing w:line="240" w:lineRule="auto"/>
+        <w:rPr>
+          <w:rFonts w:ascii="Aptos" w:hAnsi="Aptos" w:eastAsia="Aptos" w:cs="Aptos"/>
+          <w:color w:val="auto"/>
+          <w:sz w:val="22"/>
+          <w:szCs w:val="22"/>
+          <w:lang w:val="en-GB" w:eastAsia="en-US"/>
+          <w14:ligatures w14:val="standardContextual"/>
+        </w:rPr>
+      </w:pPr>
+      <w:r>
         <w:rPr>
           <w:rFonts w:ascii="Aptos" w:hAnsi="Aptos" w:eastAsia="Times New Roman" w:cs="Aptos"/>
           <w:color w:val="auto"/>
@@ -1808,257 +1839,7 @@
           <w:lang w:val="en-GB" w:eastAsia="en-US"/>
           <w14:ligatures w14:val="standardContextual"/>
         </w:rPr>
-      </w:pPr>
-      <w:r>
-        <w:rPr>
-          <w:rFonts w:ascii="Aptos" w:hAnsi="Aptos" w:eastAsia="Times New Roman" w:cs="Aptos"/>
-          <w:color w:val="auto"/>
-          <w:sz w:val="22"/>
-          <w:szCs w:val="22"/>
-          <w:lang w:val="en-GB" w:eastAsia="en-US"/>
-          <w14:ligatures w14:val="standardContextual"/>
-        </w:rPr>
-        <w:t>2</w:t>
-      </w:r>
-      <w:r>
-        <w:rPr>
-          <w:rFonts w:ascii="Aptos" w:hAnsi="Aptos" w:eastAsia="Times New Roman" w:cs="Aptos"/>
-          <w:color w:val="auto"/>
-          <w:sz w:val="22"/>
-          <w:szCs w:val="22"/>
-          <w:lang w:val="en-GB" w:eastAsia="en-US"/>
-          <w14:ligatures w14:val="standardContextual"/>
-        </w:rPr>
-        <w:t xml:space="preserve"> delegate </w:t>
-      </w:r>
-      <w:r>
-        <w:rPr>
-          <w:rFonts w:ascii="Aptos" w:hAnsi="Aptos" w:eastAsia="Times New Roman" w:cs="Aptos"/>
-          <w:color w:val="auto"/>
-          <w:sz w:val="22"/>
-          <w:szCs w:val="22"/>
-          <w:lang w:val="en-GB" w:eastAsia="en-US"/>
-          <w14:ligatures w14:val="standardContextual"/>
-        </w:rPr>
-        <w:t>pass</w:t>
-      </w:r>
-      <w:r>
-        <w:rPr>
-          <w:rFonts w:ascii="Aptos" w:hAnsi="Aptos" w:eastAsia="Times New Roman" w:cs="Aptos"/>
-          <w:color w:val="auto"/>
-          <w:sz w:val="22"/>
-          <w:szCs w:val="22"/>
-          <w:lang w:val="en-GB" w:eastAsia="en-US"/>
-          <w14:ligatures w14:val="standardContextual"/>
-        </w:rPr>
-        <w:t>es</w:t>
-      </w:r>
-      <w:r>
-        <w:rPr>
-          <w:rFonts w:ascii="Aptos" w:hAnsi="Aptos" w:eastAsia="Times New Roman" w:cs="Aptos"/>
-          <w:color w:val="auto"/>
-          <w:sz w:val="22"/>
-          <w:szCs w:val="22"/>
-          <w:lang w:val="en-GB" w:eastAsia="en-US"/>
-          <w14:ligatures w14:val="standardContextual"/>
-        </w:rPr>
-        <w:t xml:space="preserve"> for sponsor firm, full access to the event and networking sessions</w:t>
-      </w:r>
-    </w:p>
-    <w:p>
-      <w:pPr>
-        <w:numPr>
-          <w:ilvl w:val="0"/>
-          <w:numId w:val="38"/>
-        </w:numPr>
-        <w:spacing w:line="240" w:lineRule="auto"/>
-        <w:rPr>
-          <w:rFonts w:ascii="Aptos" w:hAnsi="Aptos" w:eastAsia="Times New Roman" w:cs="Aptos"/>
-          <w:color w:val="auto"/>
-          <w:sz w:val="22"/>
-          <w:szCs w:val="22"/>
-          <w:lang w:val="en-GB" w:eastAsia="en-US"/>
-          <w14:ligatures w14:val="standardContextual"/>
-        </w:rPr>
-      </w:pPr>
-      <w:r>
-        <w:rPr>
-          <w:rFonts w:ascii="Aptos" w:hAnsi="Aptos" w:eastAsia="Times New Roman" w:cs="Aptos"/>
-          <w:color w:val="auto"/>
-          <w:sz w:val="22"/>
-          <w:szCs w:val="22"/>
-          <w:lang w:val="en-GB" w:eastAsia="en-US"/>
-          <w14:ligatures w14:val="standardContextual"/>
-        </w:rPr>
-        <w:t>Delegate list supplied 1 week before the conference</w:t>
-      </w:r>
-    </w:p>
-    <w:p>
-      <w:pPr>
-        <w:numPr>
-          <w:ilvl w:val="0"/>
-          <w:numId w:val="38"/>
-        </w:numPr>
-        <w:spacing w:line="240" w:lineRule="auto"/>
-        <w:rPr>
-          <w:rFonts w:ascii="Aptos" w:hAnsi="Aptos" w:eastAsia="Times New Roman" w:cs="Aptos"/>
-          <w:color w:val="auto"/>
-          <w:sz w:val="22"/>
-          <w:szCs w:val="22"/>
-          <w:lang w:val="en-GB" w:eastAsia="en-US"/>
-          <w14:ligatures w14:val="standardContextual"/>
-        </w:rPr>
-      </w:pPr>
-      <w:r>
-        <w:rPr>
-          <w:rFonts w:ascii="Aptos" w:hAnsi="Aptos" w:eastAsia="Times New Roman" w:cs="Aptos"/>
-          <w:color w:val="auto"/>
-          <w:sz w:val="22"/>
-          <w:szCs w:val="22"/>
-          <w:lang w:val="en-GB" w:eastAsia="en-US"/>
-          <w14:ligatures w14:val="standardContextual"/>
-        </w:rPr>
-        <w:t>2 LinkedIn advert posts for the sponsor prior to the conference</w:t>
-      </w:r>
-    </w:p>
-    <w:p>
-      <w:pPr>
-        <w:numPr>
-          <w:ilvl w:val="0"/>
-          <w:numId w:val="38"/>
-        </w:numPr>
-        <w:spacing w:line="240" w:lineRule="auto"/>
-        <w:rPr>
-          <w:rFonts w:ascii="Aptos" w:hAnsi="Aptos" w:eastAsia="Times New Roman" w:cs="Aptos"/>
-          <w:color w:val="auto"/>
-          <w:sz w:val="22"/>
-          <w:szCs w:val="22"/>
-          <w:lang w:val="en-GB" w:eastAsia="en-US"/>
-          <w14:ligatures w14:val="standardContextual"/>
-        </w:rPr>
-      </w:pPr>
-      <w:r>
-        <w:rPr>
-          <w:rFonts w:ascii="Aptos" w:hAnsi="Aptos" w:eastAsia="Times New Roman" w:cs="Aptos"/>
-          <w:color w:val="auto"/>
-          <w:sz w:val="22"/>
-          <w:szCs w:val="22"/>
-          <w:lang w:val="en-GB" w:eastAsia="en-US"/>
-          <w14:ligatures w14:val="standardContextual"/>
-        </w:rPr>
-        <w:t>Access to all networking and presentation rooms Branded exposure via our media partners</w:t>
-      </w:r>
-    </w:p>
-    <w:p>
-      <w:pPr>
-        <w:numPr>
-          <w:ilvl w:val="0"/>
-          <w:numId w:val="38"/>
-        </w:numPr>
-        <w:spacing w:line="240" w:lineRule="auto"/>
-        <w:rPr>
-          <w:rFonts w:ascii="Aptos" w:hAnsi="Aptos" w:eastAsia="Times New Roman" w:cs="Aptos"/>
-          <w:color w:val="auto"/>
-          <w:sz w:val="22"/>
-          <w:szCs w:val="22"/>
-          <w:lang w:val="en-GB" w:eastAsia="en-US"/>
-          <w14:ligatures w14:val="standardContextual"/>
-        </w:rPr>
-      </w:pPr>
-      <w:r>
-        <w:rPr>
-          <w:rFonts w:ascii="Aptos" w:hAnsi="Aptos" w:eastAsia="Times New Roman" w:cs="Aptos"/>
-          <w:color w:val="auto"/>
-          <w:sz w:val="22"/>
-          <w:szCs w:val="22"/>
-          <w:lang w:val="en-GB" w:eastAsia="en-US"/>
-          <w14:ligatures w14:val="standardContextual"/>
-        </w:rPr>
-        <w:t>Online branding – Logo &amp; images of speakers and direct links to sponsor company website</w:t>
-      </w:r>
-    </w:p>
-    <w:p>
-      <w:pPr>
-        <w:numPr>
-          <w:ilvl w:val="0"/>
-          <w:numId w:val="38"/>
-        </w:numPr>
-        <w:spacing w:line="240" w:lineRule="auto"/>
-        <w:rPr>
-          <w:rFonts w:ascii="Aptos" w:hAnsi="Aptos" w:eastAsia="Times New Roman" w:cs="Aptos"/>
-          <w:color w:val="auto"/>
-          <w:sz w:val="22"/>
-          <w:szCs w:val="22"/>
-          <w:lang w:val="en-GB" w:eastAsia="en-US"/>
-          <w14:ligatures w14:val="standardContextual"/>
-        </w:rPr>
-      </w:pPr>
-      <w:r>
-        <w:rPr>
-          <w:rFonts w:ascii="Aptos" w:hAnsi="Aptos" w:eastAsia="Times New Roman" w:cs="Aptos"/>
-          <w:color w:val="auto"/>
-          <w:sz w:val="22"/>
-          <w:szCs w:val="22"/>
-          <w:lang w:val="en-GB" w:eastAsia="en-US"/>
-          <w14:ligatures w14:val="standardContextual"/>
-        </w:rPr>
-        <w:t>Marketing campaigns – included on all email campaigns prior to the event</w:t>
-      </w:r>
-    </w:p>
-    <w:p>
-      <w:pPr>
-        <w:numPr>
-          <w:ilvl w:val="0"/>
-          <w:numId w:val="38"/>
-        </w:numPr>
-        <w:spacing w:line="240" w:lineRule="auto"/>
-        <w:rPr>
-          <w:rFonts w:ascii="Aptos" w:hAnsi="Aptos" w:eastAsia="Times New Roman" w:cs="Aptos"/>
-          <w:color w:val="auto"/>
-          <w:sz w:val="22"/>
-          <w:szCs w:val="22"/>
-          <w:lang w:val="en-GB" w:eastAsia="en-US"/>
-          <w14:ligatures w14:val="standardContextual"/>
-        </w:rPr>
-      </w:pPr>
-      <w:r>
-        <w:rPr>
-          <w:rFonts w:ascii="Aptos" w:hAnsi="Aptos" w:eastAsia="Times New Roman" w:cs="Aptos"/>
-          <w:color w:val="auto"/>
-          <w:sz w:val="22"/>
-          <w:szCs w:val="22"/>
-          <w:lang w:val="en-GB" w:eastAsia="en-US"/>
-          <w14:ligatures w14:val="standardContextual"/>
-        </w:rPr>
-        <w:t xml:space="preserve">One-page A4 advert included into the conference brochure </w:t>
-      </w:r>
-    </w:p>
-    <w:p>
-      <w:pPr>
-        <w:numPr>
-          <w:ilvl w:val="0"/>
-          <w:numId w:val="38"/>
-        </w:numPr>
-        <w:spacing w:line="240" w:lineRule="auto"/>
-        <w:rPr>
-          <w:rFonts w:ascii="Aptos" w:hAnsi="Aptos" w:eastAsia="Times New Roman" w:cs="Aptos"/>
-          <w:color w:val="auto"/>
-          <w:sz w:val="22"/>
-          <w:szCs w:val="22"/>
-          <w:lang w:val="en-GB" w:eastAsia="en-US"/>
-          <w14:ligatures w14:val="standardContextual"/>
-        </w:rPr>
-      </w:pPr>
-      <w:r>
-        <w:rPr>
-          <w:rFonts w:ascii="Aptos" w:hAnsi="Aptos" w:eastAsia="Times New Roman" w:cs="Aptos"/>
-          <w:color w:val="auto"/>
-          <w:sz w:val="22"/>
-          <w:szCs w:val="22"/>
-          <w:lang w:val="en-GB" w:eastAsia="en-US"/>
-          <w14:ligatures w14:val="standardContextual"/>
-        </w:rPr>
-        <w:t>2 passes to the LPGP drinks and canapés reception after the conference</w:t>
+        <w:t>Additional Notes: {{additional_notes}}</w:t>
       </w:r>
     </w:p>
     <w:p>

</xml_diff>

<commit_message>
Fix T&C header overlap: section break with larger top margin for T&C page
The header banner graphic is ~1.52 inches tall but the page top margin was only
0.5 inches, causing T&C body text to render behind the banner diagonal.

Replace the manual page break with a Word section break (nextPage) so the T&C
section gets its own page margin settings (top=3000 twips / 2.08 inches) —
enough to push body text below the full banner extent.

https://claude.ai/code/session_01LWqSqCoTVtRhGcB3aaw8Eo
</commit_message>
<xml_diff>
--- a/public/invoice_template.docx
+++ b/public/invoice_template.docx
@@ -2196,10 +2196,16 @@
           <w:sz w:val="20"/>
           <w:szCs w:val="20"/>
         </w:rPr>
-      </w:pPr>
-      <w:r>
-        <w:br w:type="page"/>
-      </w:r>
+        <w:sectPr>
+          <w:type w:val="nextPage"/>
+          <w:headerReference w:type="default" r:id="rId11"/>
+          <w:footerReference w:type="default" r:id="rId12"/>
+          <w:pgSz w:w="12240" w:h="15840"/>
+          <w:pgMar w:top="720" w:right="864" w:bottom="1440" w:left="864" w:header="720" w:footer="720" w:gutter="0"/>
+          <w:cols w:space="720"/>
+          <w:docGrid w:linePitch="360"/>
+        </w:sectPr>
+      </w:pPr>
     </w:p>
     <w:p>
       <w:pPr>
@@ -4782,7 +4788,7 @@
       <w:headerReference w:type="default" r:id="rId11"/>
       <w:footerReference w:type="default" r:id="rId12"/>
       <w:pgSz w:w="12240" w:h="15840"/>
-      <w:pgMar w:top="720" w:right="864" w:bottom="1440" w:left="864" w:header="720" w:footer="720" w:gutter="0"/>
+      <w:pgMar w:top="3000" w:right="864" w:bottom="1440" w:left="864" w:header="720" w:footer="720" w:gutter="0"/>
       <w:cols w:space="720"/>
       <w:docGrid w:linePitch="360"/>
     </w:sectPr>

</xml_diff>